<commit_message>
Patch real Zenodo DOIs (concept 10.5281/zenodo.20024578, v0.1.1 10.5281/zenodo.20024579) in Declarations.docx
</commit_message>
<xml_diff>
--- a/manuscript/Declarations.docx
+++ b/manuscript/Declarations.docx
@@ -2,7 +2,7 @@
 <file path=word/document.xml><?xml version="1.0" encoding="utf-8"?>
 <w:document xmlns:w="http://schemas.openxmlformats.org/wordprocessingml/2006/main" xmlns:m="http://schemas.openxmlformats.org/officeDocument/2006/math" xmlns:r="http://schemas.openxmlformats.org/officeDocument/2006/relationships" xmlns:o="urn:schemas-microsoft-com:office:office" xmlns:v="urn:schemas-microsoft-com:vml" xmlns:w10="urn:schemas-microsoft-com:office:word" xmlns:a="http://schemas.openxmlformats.org/drawingml/2006/main" xmlns:pic="http://schemas.openxmlformats.org/drawingml/2006/picture" xmlns:wp="http://schemas.openxmlformats.org/drawingml/2006/wordprocessingDrawing">
   <w:body>
-    <w:bookmarkStart w:id="31" w:name="declarations-and-statements"/>
+    <w:bookmarkStart w:id="32" w:name="declarations-and-statements"/>
     <w:p>
       <w:pPr>
         <w:pStyle w:val="Heading1"/>
@@ -838,7 +838,7 @@
       </w:r>
     </w:p>
     <w:bookmarkEnd w:id="23"/>
-    <w:bookmarkStart w:id="28" w:name="data-availability-statement"/>
+    <w:bookmarkStart w:id="29" w:name="data-availability-statement"/>
     <w:p>
       <w:pPr>
         <w:pStyle w:val="Heading2"/>
@@ -920,7 +920,21 @@
         </w:r>
       </w:hyperlink>
       <w:r>
-        <w:t xml:space="preserve">; permanent versioned snapshots (pre-registration, submission and acceptance releases) are archived at Zenodo via the GitHub–Zenodo integration at &lt;https://doi.org/[Zenodo concept DOI: pending]&gt;. The corrected 10-m SOS/POS/EOS rasters and validation reference points generated for this study are available on Mendeley Data at &lt;https://doi.org/[Mendeley Data DOI: pending]&gt;. PlanetScope NICFI imagery, freely accessible to academic users worldwide via the NICFI Basemaps programme, cannot be redistributed under the NICFI programme terms; the derived validation point labels (coordinates and class labels only) are included in the Mendeley Data deposit. A complete dataset manifest with download URLs and instructions is provided in</w:t>
+        <w:t xml:space="preserve">; permanent versioned snapshots (pre-registration, submission and acceptance releases) are archived at Zenodo via the GitHub–Zenodo integration at</w:t>
+      </w:r>
+      <w:r>
+        <w:t xml:space="preserve"> </w:t>
+      </w:r>
+      <w:hyperlink r:id="rId28">
+        <w:r>
+          <w:rPr>
+            <w:rStyle w:val="Hyperlink"/>
+          </w:rPr>
+          <w:t xml:space="preserve">https://doi.org/10.5281/zenodo.20024578</w:t>
+        </w:r>
+      </w:hyperlink>
+      <w:r>
+        <w:t xml:space="preserve">. The corrected 10-m SOS/POS/EOS rasters and validation reference points generated for this study are available on Mendeley Data at &lt;https://doi.org/[Mendeley Data DOI: pending]&gt;. PlanetScope NICFI imagery, freely accessible to academic users worldwide via the NICFI Basemaps programme, cannot be redistributed under the NICFI programme terms; the derived validation point labels (coordinates and class labels only) are included in the Mendeley Data deposit. A complete dataset manifest with download URLs and instructions is provided in</w:t>
       </w:r>
       <w:r>
         <w:t xml:space="preserve"> </w:t>
@@ -942,8 +956,8 @@
         </w:pict>
       </w:r>
     </w:p>
-    <w:bookmarkEnd w:id="28"/>
-    <w:bookmarkStart w:id="29" w:name="acknowledgements"/>
+    <w:bookmarkEnd w:id="29"/>
+    <w:bookmarkStart w:id="30" w:name="acknowledgements"/>
     <w:p>
       <w:pPr>
         <w:pStyle w:val="Heading2"/>
@@ -997,8 +1011,8 @@
         </w:pict>
       </w:r>
     </w:p>
-    <w:bookmarkEnd w:id="29"/>
-    <w:bookmarkStart w:id="30" w:name="submission-declarations"/>
+    <w:bookmarkEnd w:id="30"/>
+    <w:bookmarkStart w:id="31" w:name="submission-declarations"/>
     <w:p>
       <w:pPr>
         <w:pStyle w:val="Heading2"/>
@@ -1099,8 +1113,8 @@
         <w:t xml:space="preserve">All sources of funding and any potential conflicts of interest have been disclosed.</w:t>
       </w:r>
     </w:p>
-    <w:bookmarkEnd w:id="30"/>
     <w:bookmarkEnd w:id="31"/>
+    <w:bookmarkEnd w:id="32"/>
     <w:sectPr/>
   </w:body>
 </w:document>

</xml_diff>